<commit_message>
new files final project
</commit_message>
<xml_diff>
--- a/final_project/ideas.docx
+++ b/final_project/ideas.docx
@@ -8,23 +8,7 @@
         <w:jc w:val="both"/>
       </w:pPr>
       <w:r>
-        <w:t xml:space="preserve">Hello! That sounds like a fascinating course. Evolution through programming is a </w:t>
-      </w:r>
-      <w:proofErr w:type="gramStart"/>
-      <w:r>
-        <w:t>really powerful</w:t>
-      </w:r>
-      <w:proofErr w:type="gramEnd"/>
-      <w:r>
-        <w:t xml:space="preserve"> way to understand complex biological processes. I can </w:t>
-      </w:r>
-      <w:proofErr w:type="gramStart"/>
-      <w:r>
-        <w:t>definitely help</w:t>
-      </w:r>
-      <w:proofErr w:type="gramEnd"/>
-      <w:r>
-        <w:t xml:space="preserve"> you brainstorm some ideas for your final assignment.</w:t>
+        <w:t>Hello! That sounds like a fascinating course. Evolution through programming is a really powerful way to understand complex biological processes. I can definitely help you brainstorm some ideas for your final assignment.</w:t>
       </w:r>
     </w:p>
     <w:p>
@@ -43,7 +27,7 @@
       </w:pPr>
       <w:r>
         <w:pict w14:anchorId="47CCB8FA">
-          <v:rect id="_x0000_i1037" style="width:0;height:1.5pt" o:hralign="center" o:hrstd="t" o:hr="t" fillcolor="#a0a0a0" stroked="f"/>
+          <v:rect id="_x0000_i1025" style="width:0;height:1.5pt" o:hralign="center" o:hrstd="t" o:hr="t" fillcolor="#a0a0a0" stroked="f"/>
         </w:pict>
       </w:r>
     </w:p>
@@ -74,23 +58,7 @@
           <w:b/>
           <w:bCs/>
         </w:rPr>
-        <w:t xml:space="preserve">How does the selective pressure of a constantly changing environment drive the evolution of </w:t>
-      </w:r>
-      <w:proofErr w:type="spellStart"/>
-      <w:r>
-        <w:rPr>
-          <w:b/>
-          <w:bCs/>
-        </w:rPr>
-        <w:t>generalism</w:t>
-      </w:r>
-      <w:proofErr w:type="spellEnd"/>
-      <w:r>
-        <w:rPr>
-          <w:b/>
-          <w:bCs/>
-        </w:rPr>
-        <w:t xml:space="preserve"> vs. specialism within a population?</w:t>
+        <w:t>How does the selective pressure of a constantly changing environment drive the evolution of generalism vs. specialism within a population?</w:t>
       </w:r>
     </w:p>
     <w:p>
@@ -139,15 +107,7 @@
         <w:jc w:val="both"/>
       </w:pPr>
       <w:r>
-        <w:t xml:space="preserve">This question is interesting because the balance between </w:t>
-      </w:r>
-      <w:proofErr w:type="spellStart"/>
-      <w:r>
-        <w:t>generalism</w:t>
-      </w:r>
-      <w:proofErr w:type="spellEnd"/>
-      <w:r>
-        <w:t xml:space="preserve"> and specialism is a fundamental trade-off in evolution. While specialists can be highly efficient in stable environments, generalists are often more resilient to environmental fluctuations. Understanding how fluctuating environments favor one strategy over the other, or maintain a diversity of both, has significant implications for understanding biodiversity, adaptation to climate change, and even the evolution of complex traits.</w:t>
+        <w:t>This question is interesting because the balance between generalism and specialism is a fundamental trade-off in evolution. While specialists can be highly efficient in stable environments, generalists are often more resilient to environmental fluctuations. Understanding how fluctuating environments favor one strategy over the other, or maintain a diversity of both, has significant implications for understanding biodiversity, adaptation to climate change, and even the evolution of complex traits.</w:t>
       </w:r>
     </w:p>
     <w:p>
@@ -157,7 +117,7 @@
       </w:pPr>
       <w:r>
         <w:pict w14:anchorId="13E11D59">
-          <v:rect id="_x0000_i1038" style="width:0;height:1.5pt" o:hralign="center" o:hrstd="t" o:hr="t" fillcolor="#a0a0a0" stroked="f"/>
+          <v:rect id="_x0000_i1026" style="width:0;height:1.5pt" o:hralign="center" o:hrstd="t" o:hr="t" fillcolor="#a0a0a0" stroked="f"/>
         </w:pict>
       </w:r>
     </w:p>
@@ -374,15 +334,7 @@
         <w:t>Resource utilization efficiency:</w:t>
       </w:r>
       <w:r>
-        <w:t xml:space="preserve"> How well it can process different resource types. This is where you encode </w:t>
-      </w:r>
-      <w:proofErr w:type="spellStart"/>
-      <w:r>
-        <w:t>generalism</w:t>
-      </w:r>
-      <w:proofErr w:type="spellEnd"/>
-      <w:r>
-        <w:t>/specialism. A specialist might be highly efficient at one resource type but terrible at others, while a generalist is moderately efficient across many.</w:t>
+        <w:t xml:space="preserve"> How well it can process different resource types. This is where you encode generalism/specialism. A specialist might be highly efficient at one resource type but terrible at others, while a generalist is moderately efficient across many.</w:t>
       </w:r>
     </w:p>
     <w:p>
@@ -836,23 +788,7 @@
           <w:b/>
           <w:bCs/>
         </w:rPr>
-        <w:t xml:space="preserve">Average </w:t>
-      </w:r>
-      <w:proofErr w:type="spellStart"/>
-      <w:r>
-        <w:rPr>
-          <w:b/>
-          <w:bCs/>
-        </w:rPr>
-        <w:t>generalism</w:t>
-      </w:r>
-      <w:proofErr w:type="spellEnd"/>
-      <w:r>
-        <w:rPr>
-          <w:b/>
-          <w:bCs/>
-        </w:rPr>
-        <w:t>/specialism in the population over time:</w:t>
+        <w:t>Average generalism/specialism in the population over time:</w:t>
       </w:r>
       <w:r>
         <w:t xml:space="preserve"> Track the distribution of resource utilization efficiencies.</w:t>
@@ -1158,23 +1094,7 @@
         <w:jc w:val="both"/>
       </w:pPr>
       <w:r>
-        <w:t xml:space="preserve">Prey agents: Have traits like speed, </w:t>
-      </w:r>
-      <w:proofErr w:type="spellStart"/>
-      <w:r>
-        <w:t>camouflage_level</w:t>
-      </w:r>
-      <w:proofErr w:type="spellEnd"/>
-      <w:r>
-        <w:t xml:space="preserve">, </w:t>
-      </w:r>
-      <w:proofErr w:type="spellStart"/>
-      <w:r>
-        <w:t>reproduction_rate</w:t>
-      </w:r>
-      <w:proofErr w:type="spellEnd"/>
-      <w:r>
-        <w:t>, energy.</w:t>
+        <w:t>Prey agents: Have traits like speed, camouflage_level, reproduction_rate, energy.</w:t>
       </w:r>
     </w:p>
     <w:p>
@@ -1187,23 +1107,7 @@
         <w:jc w:val="both"/>
       </w:pPr>
       <w:r>
-        <w:t xml:space="preserve">Predator agents: Have traits like speed, </w:t>
-      </w:r>
-      <w:proofErr w:type="spellStart"/>
-      <w:r>
-        <w:t>hunting_skill</w:t>
-      </w:r>
-      <w:proofErr w:type="spellEnd"/>
-      <w:r>
-        <w:t xml:space="preserve">, </w:t>
-      </w:r>
-      <w:proofErr w:type="spellStart"/>
-      <w:r>
-        <w:t>reproduction_rate</w:t>
-      </w:r>
-      <w:proofErr w:type="spellEnd"/>
-      <w:r>
-        <w:t>, energy.</w:t>
+        <w:t>Predator agents: Have traits like speed, hunting_skill, reproduction_rate, energy.</w:t>
       </w:r>
     </w:p>
     <w:p>
@@ -1329,39 +1233,7 @@
         <w:jc w:val="both"/>
       </w:pPr>
       <w:r>
-        <w:t xml:space="preserve">When a predator encounters prey, a "hunt" event occurs. The success of the hunt depends on the relative values of their traits (e.g., </w:t>
-      </w:r>
-      <w:proofErr w:type="spellStart"/>
-      <w:r>
-        <w:t>predator_speed</w:t>
-      </w:r>
-      <w:proofErr w:type="spellEnd"/>
-      <w:r>
-        <w:t xml:space="preserve"> vs. </w:t>
-      </w:r>
-      <w:proofErr w:type="spellStart"/>
-      <w:r>
-        <w:t>prey_speed</w:t>
-      </w:r>
-      <w:proofErr w:type="spellEnd"/>
-      <w:r>
-        <w:t xml:space="preserve">, </w:t>
-      </w:r>
-      <w:proofErr w:type="spellStart"/>
-      <w:r>
-        <w:t>predator_hunting_skill</w:t>
-      </w:r>
-      <w:proofErr w:type="spellEnd"/>
-      <w:r>
-        <w:t xml:space="preserve"> vs. </w:t>
-      </w:r>
-      <w:proofErr w:type="spellStart"/>
-      <w:r>
-        <w:t>prey_camouflage</w:t>
-      </w:r>
-      <w:proofErr w:type="spellEnd"/>
-      <w:r>
-        <w:t>).</w:t>
+        <w:t>When a predator encounters prey, a "hunt" event occurs. The success of the hunt depends on the relative values of their traits (e.g., predator_speed vs. prey_speed, predator_hunting_skill vs. prey_camouflage).</w:t>
       </w:r>
     </w:p>
     <w:p>
@@ -1848,15 +1720,7 @@
         <w:t>Average traits over time for both populations:</w:t>
       </w:r>
       <w:r>
-        <w:t xml:space="preserve"> Are predators getting faster? </w:t>
-      </w:r>
-      <w:proofErr w:type="gramStart"/>
-      <w:r>
-        <w:t>Are</w:t>
-      </w:r>
-      <w:proofErr w:type="gramEnd"/>
-      <w:r>
-        <w:t xml:space="preserve"> prey getting faster and more camouflaged?</w:t>
+        <w:t xml:space="preserve"> Are predators getting faster? Are prey getting faster and more camouflaged?</w:t>
       </w:r>
     </w:p>
     <w:p>
@@ -1917,15 +1781,7 @@
         <w:t>Evolutionary "lag":</w:t>
       </w:r>
       <w:r>
-        <w:t xml:space="preserve"> Does one species consistently </w:t>
-      </w:r>
-      <w:proofErr w:type="gramStart"/>
-      <w:r>
-        <w:t>lag behind</w:t>
-      </w:r>
-      <w:proofErr w:type="gramEnd"/>
-      <w:r>
-        <w:t xml:space="preserve"> the other in the arms race?</w:t>
+        <w:t xml:space="preserve"> Does one species consistently lag behind the other in the arms race?</w:t>
       </w:r>
     </w:p>
     <w:p>
@@ -1944,7 +1800,7 @@
       </w:pPr>
       <w:r>
         <w:pict w14:anchorId="7E352E74">
-          <v:rect id="_x0000_i1051" style="width:0;height:1.5pt" o:hralign="center" o:hrstd="t" o:hr="t" fillcolor="#a0a0a0" stroked="f"/>
+          <v:rect id="_x0000_i1027" style="width:0;height:1.5pt" o:hralign="center" o:hrstd="t" o:hr="t" fillcolor="#a0a0a0" stroked="f"/>
         </w:pict>
       </w:r>
     </w:p>
@@ -1962,6 +1818,178 @@
         <w:bidi w:val="0"/>
         <w:jc w:val="both"/>
       </w:pPr>
+    </w:p>
+    <w:p>
+      <w:pPr>
+        <w:bidi w:val="0"/>
+        <w:jc w:val="both"/>
+      </w:pPr>
+    </w:p>
+    <w:p>
+      <w:pPr>
+        <w:bidi w:val="0"/>
+        <w:jc w:val="both"/>
+      </w:pPr>
+    </w:p>
+    <w:p>
+      <w:pPr>
+        <w:bidi w:val="0"/>
+        <w:jc w:val="both"/>
+      </w:pPr>
+      <w:r>
+        <w:t>Predator-prey dynamics are an evolutionary force that creates a drive for an arms-race between the two populations. Predators acquire traits that help them catch the prey faster and the prey develops techniques to avoid encounters with predators. We would like to simulate two populations, let them co-evolve throughout the simulation and analyze the evolutionary patterns: how complex do the populations become? How to improvements to one population affect the size of the other? What is the evolutionary lag between one population's evolution and the evolutionary response of the other? We can use principles studied in class such as mutations and fitness calculations to address this question. We hope to show agreement with the Lotka-Volterra model of predator-prey interaction.</w:t>
+      </w:r>
+    </w:p>
+    <w:p>
+      <w:pPr>
+        <w:jc w:val="both"/>
+      </w:pPr>
+    </w:p>
+    <w:p>
+      <w:pPr>
+        <w:jc w:val="both"/>
+        <w:rPr>
+          <w:rtl/>
+        </w:rPr>
+      </w:pPr>
+      <w:r>
+        <w:rPr>
+          <w:rFonts w:hint="cs"/>
+          <w:rtl/>
+        </w:rPr>
+        <w:t>חלוקת משימות</w:t>
+      </w:r>
+    </w:p>
+    <w:p>
+      <w:pPr>
+        <w:pStyle w:val="a9"/>
+        <w:numPr>
+          <w:ilvl w:val="2"/>
+          <w:numId w:val="8"/>
+        </w:numPr>
+        <w:jc w:val="both"/>
+      </w:pPr>
+      <w:r>
+        <w:rPr>
+          <w:rFonts w:hint="cs"/>
+          <w:rtl/>
+        </w:rPr>
+        <w:t>בסיס לקוד</w:t>
+      </w:r>
+    </w:p>
+    <w:p>
+      <w:pPr>
+        <w:pStyle w:val="a9"/>
+        <w:numPr>
+          <w:ilvl w:val="2"/>
+          <w:numId w:val="8"/>
+        </w:numPr>
+        <w:jc w:val="both"/>
+      </w:pPr>
+      <w:r>
+        <w:rPr>
+          <w:rFonts w:hint="cs"/>
+          <w:rtl/>
+        </w:rPr>
+        <w:t xml:space="preserve">להגדיר משוואות </w:t>
+      </w:r>
+      <w:r>
+        <w:rPr>
+          <w:rtl/>
+        </w:rPr>
+        <w:t>–</w:t>
+      </w:r>
+      <w:r>
+        <w:rPr>
+          <w:rFonts w:hint="cs"/>
+          <w:rtl/>
+        </w:rPr>
+        <w:t xml:space="preserve"> פונקציות </w:t>
+      </w:r>
+      <w:r>
+        <w:t>fitness</w:t>
+      </w:r>
+    </w:p>
+    <w:p>
+      <w:pPr>
+        <w:pStyle w:val="a9"/>
+        <w:numPr>
+          <w:ilvl w:val="2"/>
+          <w:numId w:val="8"/>
+        </w:numPr>
+        <w:jc w:val="both"/>
+      </w:pPr>
+      <w:r>
+        <w:rPr>
+          <w:rFonts w:hint="cs"/>
+          <w:rtl/>
+        </w:rPr>
+        <w:t xml:space="preserve">להוציא גרפים של </w:t>
+      </w:r>
+      <w:r>
+        <w:t>population size</w:t>
+      </w:r>
+    </w:p>
+    <w:p>
+      <w:pPr>
+        <w:pStyle w:val="a9"/>
+        <w:numPr>
+          <w:ilvl w:val="2"/>
+          <w:numId w:val="8"/>
+        </w:numPr>
+        <w:jc w:val="both"/>
+      </w:pPr>
+      <w:r>
+        <w:rPr>
+          <w:rFonts w:hint="cs"/>
+          <w:rtl/>
+        </w:rPr>
+        <w:t>לכתוב את הדוח</w:t>
+      </w:r>
+    </w:p>
+    <w:p>
+      <w:pPr>
+        <w:pStyle w:val="a9"/>
+        <w:numPr>
+          <w:ilvl w:val="2"/>
+          <w:numId w:val="8"/>
+        </w:numPr>
+        <w:jc w:val="both"/>
+        <w:rPr>
+          <w:rFonts w:hint="cs"/>
+          <w:rtl/>
+        </w:rPr>
+      </w:pPr>
+      <w:r>
+        <w:rPr>
+          <w:rFonts w:hint="cs"/>
+          <w:rtl/>
+        </w:rPr>
+        <w:t xml:space="preserve">לבדוק אם הגרפים מתכתבים עם </w:t>
+      </w:r>
+      <w:r>
+        <w:t>lotka Volterra</w:t>
+      </w:r>
+      <w:r>
+        <w:rPr>
+          <w:rFonts w:hint="cs"/>
+          <w:rtl/>
+        </w:rPr>
+        <w:t xml:space="preserve"> </w:t>
+      </w:r>
+      <w:r>
+        <w:rPr>
+          <w:rtl/>
+        </w:rPr>
+        <w:t>–</w:t>
+      </w:r>
+      <w:r>
+        <w:rPr>
+          <w:rFonts w:hint="cs"/>
+          <w:rtl/>
+        </w:rPr>
+        <w:t xml:space="preserve"> לקחת את המשוואות המקוריות שלהם</w:t>
+      </w:r>
     </w:p>
     <w:sectPr>
       <w:pgSz w:w="11906" w:h="16838"/>
@@ -1980,7 +2008,7 @@
   <w:abstractNum w:abstractNumId="0" w15:restartNumberingAfterBreak="0">
     <w:nsid w:val="1CED660E"/>
     <w:multiLevelType w:val="multilevel"/>
-    <w:tmpl w:val="F6B66482"/>
+    <w:tmpl w:val="C924DF1E"/>
     <w:lvl w:ilvl="0">
       <w:start w:val="1"/>
       <w:numFmt w:val="bullet"/>
@@ -2009,20 +2037,16 @@
         <w:ind w:left="1440" w:hanging="360"/>
       </w:pPr>
     </w:lvl>
-    <w:lvl w:ilvl="2" w:tentative="1">
-      <w:start w:val="1"/>
-      <w:numFmt w:val="bullet"/>
-      <w:lvlText w:val=""/>
-      <w:lvlJc w:val="left"/>
-      <w:pPr>
-        <w:tabs>
-          <w:tab w:val="num" w:pos="2160"/>
-        </w:tabs>
+    <w:lvl w:ilvl="2">
+      <w:start w:val="28"/>
+      <w:numFmt w:val="bullet"/>
+      <w:lvlText w:val="-"/>
+      <w:lvlJc w:val="left"/>
+      <w:pPr>
         <w:ind w:left="2160" w:hanging="360"/>
       </w:pPr>
       <w:rPr>
-        <w:rFonts w:ascii="Wingdings" w:hAnsi="Wingdings" w:hint="default"/>
-        <w:sz w:val="20"/>
+        <w:rFonts w:ascii="Arial" w:eastAsiaTheme="minorHAnsi" w:hAnsi="Arial" w:cs="Arial" w:hint="default"/>
       </w:rPr>
     </w:lvl>
     <w:lvl w:ilvl="3" w:tentative="1">
@@ -3894,6 +3918,7 @@
   <w:style w:type="character" w:default="1" w:styleId="a0">
     <w:name w:val="Default Paragraph Font"/>
     <w:uiPriority w:val="1"/>
+    <w:semiHidden/>
     <w:unhideWhenUsed/>
   </w:style>
   <w:style w:type="table" w:default="1" w:styleId="a1">

</xml_diff>